<commit_message>
commit create controller user and register user use postmain and resend
</commit_message>
<xml_diff>
--- a/DỰ ÁN.docx
+++ b/DỰ ÁN.docx
@@ -571,6 +571,9 @@
         </w:tabs>
       </w:pPr>
       <w:r>
+        <w:rPr>
+          <w:noProof/>
+        </w:rPr>
         <w:drawing>
           <wp:inline distT="0" distB="0" distL="0" distR="0" wp14:anchorId="68CA1D92" wp14:editId="21DE9C21">
             <wp:extent cx="6120765" cy="4170045"/>
@@ -706,22 +709,19 @@
       </w:pPr>
       <w:r>
         <w:lastRenderedPageBreak/>
-        <w:t xml:space="preserve">B23: File </w:t>
-      </w:r>
-      <w:r>
-        <w:t>user.model.js</w:t>
-      </w:r>
-      <w:r>
-        <w:t xml:space="preserve"> sẽ có nội dung như sau:</w:t>
-      </w:r>
-    </w:p>
-    <w:p>
-      <w:pPr>
-        <w:tabs>
-          <w:tab w:val="left" w:pos="1302"/>
-        </w:tabs>
-      </w:pPr>
-      <w:r>
+        <w:t>B23: File user.model.js sẽ có nội dung như sau:</w:t>
+      </w:r>
+    </w:p>
+    <w:p>
+      <w:pPr>
+        <w:tabs>
+          <w:tab w:val="left" w:pos="1302"/>
+        </w:tabs>
+      </w:pPr>
+      <w:r>
+        <w:rPr>
+          <w:noProof/>
+        </w:rPr>
         <w:drawing>
           <wp:inline distT="0" distB="0" distL="0" distR="0" wp14:anchorId="0039AE63" wp14:editId="1CDCCEB1">
             <wp:extent cx="2734057" cy="8449854"/>
@@ -774,25 +774,19 @@
       </w:pPr>
       <w:r>
         <w:lastRenderedPageBreak/>
-        <w:t xml:space="preserve">B24: </w:t>
-      </w:r>
-      <w:r>
-        <w:t xml:space="preserve">File </w:t>
-      </w:r>
-      <w:r>
-        <w:t>address</w:t>
-      </w:r>
-      <w:r>
-        <w:t>.model.js sẽ có nội dung như sau:</w:t>
-      </w:r>
-    </w:p>
-    <w:p>
-      <w:pPr>
-        <w:tabs>
-          <w:tab w:val="left" w:pos="1302"/>
-        </w:tabs>
-      </w:pPr>
-      <w:r>
+        <w:t>B24: File address.model.js sẽ có nội dung như sau:</w:t>
+      </w:r>
+    </w:p>
+    <w:p>
+      <w:pPr>
+        <w:tabs>
+          <w:tab w:val="left" w:pos="1302"/>
+        </w:tabs>
+      </w:pPr>
+      <w:r>
+        <w:rPr>
+          <w:noProof/>
+        </w:rPr>
         <w:drawing>
           <wp:inline distT="0" distB="0" distL="0" distR="0" wp14:anchorId="3CB4AAA0" wp14:editId="0582C585">
             <wp:extent cx="4937004" cy="6817767"/>
@@ -880,28 +874,19 @@
       </w:pPr>
       <w:r>
         <w:lastRenderedPageBreak/>
-        <w:t>B2</w:t>
-      </w:r>
-      <w:r>
-        <w:t>5</w:t>
-      </w:r>
-      <w:r>
-        <w:t xml:space="preserve">: File </w:t>
-      </w:r>
-      <w:r>
-        <w:t>product</w:t>
-      </w:r>
-      <w:r>
-        <w:t>.model.js sẽ có nội dung như sau:</w:t>
-      </w:r>
-    </w:p>
-    <w:p>
-      <w:pPr>
-        <w:tabs>
-          <w:tab w:val="left" w:pos="1302"/>
-        </w:tabs>
-      </w:pPr>
-      <w:r>
+        <w:t>B25: File product.model.js sẽ có nội dung như sau:</w:t>
+      </w:r>
+    </w:p>
+    <w:p>
+      <w:pPr>
+        <w:tabs>
+          <w:tab w:val="left" w:pos="1302"/>
+        </w:tabs>
+      </w:pPr>
+      <w:r>
+        <w:rPr>
+          <w:noProof/>
+        </w:rPr>
         <w:drawing>
           <wp:inline distT="0" distB="0" distL="0" distR="0" wp14:anchorId="0E29B822" wp14:editId="4AB1D2EB">
             <wp:extent cx="4248743" cy="8735644"/>
@@ -947,28 +932,19 @@
       </w:pPr>
       <w:r>
         <w:lastRenderedPageBreak/>
-        <w:t>B2</w:t>
-      </w:r>
-      <w:r>
-        <w:t>6</w:t>
-      </w:r>
-      <w:r>
-        <w:t xml:space="preserve">: File </w:t>
-      </w:r>
-      <w:r>
-        <w:t>category</w:t>
-      </w:r>
-      <w:r>
-        <w:t>.model.js sẽ có nội dung như sau:</w:t>
-      </w:r>
-    </w:p>
-    <w:p>
-      <w:pPr>
-        <w:tabs>
-          <w:tab w:val="left" w:pos="1302"/>
-        </w:tabs>
-      </w:pPr>
-      <w:r>
+        <w:t>B26: File category.model.js sẽ có nội dung như sau:</w:t>
+      </w:r>
+    </w:p>
+    <w:p>
+      <w:pPr>
+        <w:tabs>
+          <w:tab w:val="left" w:pos="1302"/>
+        </w:tabs>
+      </w:pPr>
+      <w:r>
+        <w:rPr>
+          <w:noProof/>
+        </w:rPr>
         <w:drawing>
           <wp:inline distT="0" distB="0" distL="0" distR="0" wp14:anchorId="08ABF7FF" wp14:editId="38A8A870">
             <wp:extent cx="4381267" cy="2989025"/>
@@ -1013,28 +989,19 @@
         </w:tabs>
       </w:pPr>
       <w:r>
-        <w:t>B2</w:t>
-      </w:r>
-      <w:r>
-        <w:t>7</w:t>
-      </w:r>
-      <w:r>
-        <w:t xml:space="preserve">: File </w:t>
-      </w:r>
-      <w:r>
-        <w:t>subC</w:t>
-      </w:r>
-      <w:r>
-        <w:t>ategory.model.js sẽ có nội dung như sau:</w:t>
-      </w:r>
-    </w:p>
-    <w:p>
-      <w:pPr>
-        <w:tabs>
-          <w:tab w:val="left" w:pos="1302"/>
-        </w:tabs>
-      </w:pPr>
-      <w:r>
+        <w:t>B27: File subCategory.model.js sẽ có nội dung như sau:</w:t>
+      </w:r>
+    </w:p>
+    <w:p>
+      <w:pPr>
+        <w:tabs>
+          <w:tab w:val="left" w:pos="1302"/>
+        </w:tabs>
+      </w:pPr>
+      <w:r>
+        <w:rPr>
+          <w:noProof/>
+        </w:rPr>
         <w:drawing>
           <wp:inline distT="0" distB="0" distL="0" distR="0" wp14:anchorId="47E5DDE3" wp14:editId="6B644F48">
             <wp:extent cx="5088104" cy="3971139"/>
@@ -1108,28 +1075,19 @@
       </w:pPr>
       <w:r>
         <w:lastRenderedPageBreak/>
-        <w:t>B2</w:t>
-      </w:r>
-      <w:r>
-        <w:t>8</w:t>
-      </w:r>
-      <w:r>
-        <w:t xml:space="preserve">: File </w:t>
-      </w:r>
-      <w:r>
-        <w:t>order</w:t>
-      </w:r>
-      <w:r>
-        <w:t>.model.js sẽ có nội dung như sau:</w:t>
-      </w:r>
-    </w:p>
-    <w:p>
-      <w:pPr>
-        <w:tabs>
-          <w:tab w:val="left" w:pos="1302"/>
-        </w:tabs>
-      </w:pPr>
-      <w:r>
+        <w:t>B28: File order.model.js sẽ có nội dung như sau:</w:t>
+      </w:r>
+    </w:p>
+    <w:p>
+      <w:pPr>
+        <w:tabs>
+          <w:tab w:val="left" w:pos="1302"/>
+        </w:tabs>
+      </w:pPr>
+      <w:r>
+        <w:rPr>
+          <w:noProof/>
+        </w:rPr>
         <w:drawing>
           <wp:inline distT="0" distB="0" distL="0" distR="0" wp14:anchorId="07143C22" wp14:editId="4EF56D7D">
             <wp:extent cx="3934374" cy="7859222"/>
@@ -1196,13 +1154,7 @@
       </w:pPr>
       <w:r>
         <w:lastRenderedPageBreak/>
-        <w:t>B2</w:t>
-      </w:r>
-      <w:r>
-        <w:t>9</w:t>
-      </w:r>
-      <w:r>
-        <w:t xml:space="preserve">: File </w:t>
+        <w:t xml:space="preserve">B29: File </w:t>
       </w:r>
       <w:r>
         <w:t>cartProduct</w:t>
@@ -1218,6 +1170,9 @@
         </w:tabs>
       </w:pPr>
       <w:r>
+        <w:rPr>
+          <w:noProof/>
+        </w:rPr>
         <w:drawing>
           <wp:inline distT="0" distB="0" distL="0" distR="0" wp14:anchorId="053D9589" wp14:editId="53AD9AEF">
             <wp:extent cx="4879238" cy="3729157"/>
@@ -1261,13 +1216,706 @@
           <w:tab w:val="left" w:pos="1302"/>
         </w:tabs>
       </w:pPr>
-    </w:p>
-    <w:p>
-      <w:pPr>
-        <w:tabs>
-          <w:tab w:val="left" w:pos="1302"/>
-        </w:tabs>
-      </w:pPr>
+      <w:r>
+        <w:t xml:space="preserve">B30: Tạo thư mục </w:t>
+      </w:r>
+      <w:r>
+        <w:rPr>
+          <w:highlight w:val="yellow"/>
+        </w:rPr>
+        <w:t>controller</w:t>
+      </w:r>
+      <w:r>
+        <w:t xml:space="preserve"> và tạo file user.controller.js</w:t>
+      </w:r>
+    </w:p>
+    <w:p>
+      <w:pPr>
+        <w:tabs>
+          <w:tab w:val="left" w:pos="1302"/>
+        </w:tabs>
+      </w:pPr>
+      <w:r>
+        <w:t xml:space="preserve">B31: Trong thư mục </w:t>
+      </w:r>
+      <w:r>
+        <w:rPr>
+          <w:highlight w:val="yellow"/>
+        </w:rPr>
+        <w:t>config</w:t>
+      </w:r>
+      <w:r>
+        <w:t xml:space="preserve"> tạo file sendEmail.js</w:t>
+      </w:r>
+    </w:p>
+    <w:p>
+      <w:pPr>
+        <w:tabs>
+          <w:tab w:val="left" w:pos="1302"/>
+        </w:tabs>
+      </w:pPr>
+      <w:r>
+        <w:t>B32: Truy cập resend.com đăng nhập và vào mục API keys copy key vào .env</w:t>
+      </w:r>
+    </w:p>
+    <w:p>
+      <w:pPr>
+        <w:tabs>
+          <w:tab w:val="left" w:pos="1302"/>
+        </w:tabs>
+      </w:pPr>
+      <w:r>
+        <w:drawing>
+          <wp:inline distT="0" distB="0" distL="0" distR="0" wp14:anchorId="49B6BE4A" wp14:editId="7DF63537">
+            <wp:extent cx="6120765" cy="1011555"/>
+            <wp:effectExtent l="0" t="0" r="0" b="0"/>
+            <wp:docPr id="141437106" name="Picture 1" descr="A screen shot of a computer&#10;&#10;Description automatically generated"/>
+            <wp:cNvGraphicFramePr>
+              <a:graphicFrameLocks xmlns:a="http://schemas.openxmlformats.org/drawingml/2006/main" noChangeAspect="1"/>
+            </wp:cNvGraphicFramePr>
+            <a:graphic xmlns:a="http://schemas.openxmlformats.org/drawingml/2006/main">
+              <a:graphicData uri="http://schemas.openxmlformats.org/drawingml/2006/picture">
+                <pic:pic xmlns:pic="http://schemas.openxmlformats.org/drawingml/2006/picture">
+                  <pic:nvPicPr>
+                    <pic:cNvPr id="141437106" name="Picture 1" descr="A screen shot of a computer&#10;&#10;Description automatically generated"/>
+                    <pic:cNvPicPr/>
+                  </pic:nvPicPr>
+                  <pic:blipFill>
+                    <a:blip r:embed="rId19"/>
+                    <a:stretch>
+                      <a:fillRect/>
+                    </a:stretch>
+                  </pic:blipFill>
+                  <pic:spPr>
+                    <a:xfrm>
+                      <a:off x="0" y="0"/>
+                      <a:ext cx="6120765" cy="1011555"/>
+                    </a:xfrm>
+                    <a:prstGeom prst="rect">
+                      <a:avLst/>
+                    </a:prstGeom>
+                  </pic:spPr>
+                </pic:pic>
+              </a:graphicData>
+            </a:graphic>
+          </wp:inline>
+        </w:drawing>
+      </w:r>
+    </w:p>
+    <w:p>
+      <w:pPr>
+        <w:tabs>
+          <w:tab w:val="left" w:pos="1302"/>
+        </w:tabs>
+      </w:pPr>
+    </w:p>
+    <w:p>
+      <w:pPr>
+        <w:tabs>
+          <w:tab w:val="left" w:pos="1302"/>
+        </w:tabs>
+      </w:pPr>
+    </w:p>
+    <w:p>
+      <w:pPr>
+        <w:tabs>
+          <w:tab w:val="left" w:pos="1302"/>
+        </w:tabs>
+      </w:pPr>
+    </w:p>
+    <w:p>
+      <w:pPr>
+        <w:tabs>
+          <w:tab w:val="left" w:pos="1302"/>
+        </w:tabs>
+      </w:pPr>
+    </w:p>
+    <w:p>
+      <w:pPr>
+        <w:tabs>
+          <w:tab w:val="left" w:pos="1302"/>
+        </w:tabs>
+      </w:pPr>
+    </w:p>
+    <w:p>
+      <w:pPr>
+        <w:tabs>
+          <w:tab w:val="left" w:pos="1302"/>
+        </w:tabs>
+      </w:pPr>
+    </w:p>
+    <w:p>
+      <w:pPr>
+        <w:tabs>
+          <w:tab w:val="left" w:pos="1302"/>
+        </w:tabs>
+      </w:pPr>
+    </w:p>
+    <w:p>
+      <w:pPr>
+        <w:tabs>
+          <w:tab w:val="left" w:pos="1302"/>
+        </w:tabs>
+      </w:pPr>
+    </w:p>
+    <w:p>
+      <w:pPr>
+        <w:tabs>
+          <w:tab w:val="left" w:pos="1302"/>
+        </w:tabs>
+      </w:pPr>
+    </w:p>
+    <w:p>
+      <w:pPr>
+        <w:tabs>
+          <w:tab w:val="left" w:pos="1302"/>
+        </w:tabs>
+      </w:pPr>
+      <w:r>
+        <w:lastRenderedPageBreak/>
+        <w:t xml:space="preserve">B33: Mở terminal chạy lệnh </w:t>
+      </w:r>
+      <w:r>
+        <w:rPr>
+          <w:highlight w:val="cyan"/>
+        </w:rPr>
+        <w:t>npm i resend</w:t>
+      </w:r>
+    </w:p>
+    <w:p>
+      <w:pPr>
+        <w:tabs>
+          <w:tab w:val="left" w:pos="1302"/>
+        </w:tabs>
+      </w:pPr>
+      <w:r>
+        <w:t>B3</w:t>
+      </w:r>
+      <w:r>
+        <w:t>4</w:t>
+      </w:r>
+      <w:r>
+        <w:t>: Trong file sendEmail.js viết</w:t>
+      </w:r>
+    </w:p>
+    <w:p>
+      <w:pPr>
+        <w:tabs>
+          <w:tab w:val="left" w:pos="1302"/>
+        </w:tabs>
+      </w:pPr>
+      <w:r>
+        <w:drawing>
+          <wp:inline distT="0" distB="0" distL="0" distR="0" wp14:anchorId="7A8C4CDA" wp14:editId="5A240048">
+            <wp:extent cx="3905250" cy="3952247"/>
+            <wp:effectExtent l="0" t="0" r="0" b="0"/>
+            <wp:docPr id="779217482" name="Picture 1" descr="A screen shot of a computer program&#10;&#10;Description automatically generated"/>
+            <wp:cNvGraphicFramePr>
+              <a:graphicFrameLocks xmlns:a="http://schemas.openxmlformats.org/drawingml/2006/main" noChangeAspect="1"/>
+            </wp:cNvGraphicFramePr>
+            <a:graphic xmlns:a="http://schemas.openxmlformats.org/drawingml/2006/main">
+              <a:graphicData uri="http://schemas.openxmlformats.org/drawingml/2006/picture">
+                <pic:pic xmlns:pic="http://schemas.openxmlformats.org/drawingml/2006/picture">
+                  <pic:nvPicPr>
+                    <pic:cNvPr id="779217482" name="Picture 1" descr="A screen shot of a computer program&#10;&#10;Description automatically generated"/>
+                    <pic:cNvPicPr/>
+                  </pic:nvPicPr>
+                  <pic:blipFill>
+                    <a:blip r:embed="rId20"/>
+                    <a:stretch>
+                      <a:fillRect/>
+                    </a:stretch>
+                  </pic:blipFill>
+                  <pic:spPr>
+                    <a:xfrm>
+                      <a:off x="0" y="0"/>
+                      <a:ext cx="3908899" cy="3955940"/>
+                    </a:xfrm>
+                    <a:prstGeom prst="rect">
+                      <a:avLst/>
+                    </a:prstGeom>
+                  </pic:spPr>
+                </pic:pic>
+              </a:graphicData>
+            </a:graphic>
+          </wp:inline>
+        </w:drawing>
+      </w:r>
+    </w:p>
+    <w:p>
+      <w:r>
+        <w:t>B3</w:t>
+      </w:r>
+      <w:r>
+        <w:t>5</w:t>
+      </w:r>
+      <w:r>
+        <w:t xml:space="preserve">: Tạo thư mục </w:t>
+      </w:r>
+      <w:r>
+        <w:rPr>
+          <w:highlight w:val="yellow"/>
+        </w:rPr>
+        <w:t>utils</w:t>
+      </w:r>
+      <w:r>
+        <w:t xml:space="preserve"> trong thư mục </w:t>
+      </w:r>
+      <w:r>
+        <w:rPr>
+          <w:highlight w:val="yellow"/>
+        </w:rPr>
+        <w:t>server</w:t>
+      </w:r>
+    </w:p>
+    <w:p>
+      <w:r>
+        <w:t>B3</w:t>
+      </w:r>
+      <w:r>
+        <w:t>6</w:t>
+      </w:r>
+      <w:r>
+        <w:t xml:space="preserve">: Trong thư mục </w:t>
+      </w:r>
+      <w:r>
+        <w:rPr>
+          <w:highlight w:val="yellow"/>
+        </w:rPr>
+        <w:t>utils</w:t>
+      </w:r>
+      <w:r>
+        <w:t xml:space="preserve"> tạo file verifyEmailTemplate.js</w:t>
+      </w:r>
+    </w:p>
+    <w:p>
+      <w:r>
+        <w:drawing>
+          <wp:inline distT="0" distB="0" distL="0" distR="0" wp14:anchorId="31239D14" wp14:editId="7A29EDF6">
+            <wp:extent cx="6120765" cy="1811020"/>
+            <wp:effectExtent l="0" t="0" r="0" b="0"/>
+            <wp:docPr id="2037707186" name="Picture 1" descr="A screen shot of a computer code&#10;&#10;Description automatically generated"/>
+            <wp:cNvGraphicFramePr>
+              <a:graphicFrameLocks xmlns:a="http://schemas.openxmlformats.org/drawingml/2006/main" noChangeAspect="1"/>
+            </wp:cNvGraphicFramePr>
+            <a:graphic xmlns:a="http://schemas.openxmlformats.org/drawingml/2006/main">
+              <a:graphicData uri="http://schemas.openxmlformats.org/drawingml/2006/picture">
+                <pic:pic xmlns:pic="http://schemas.openxmlformats.org/drawingml/2006/picture">
+                  <pic:nvPicPr>
+                    <pic:cNvPr id="2037707186" name="Picture 1" descr="A screen shot of a computer code&#10;&#10;Description automatically generated"/>
+                    <pic:cNvPicPr/>
+                  </pic:nvPicPr>
+                  <pic:blipFill>
+                    <a:blip r:embed="rId21"/>
+                    <a:stretch>
+                      <a:fillRect/>
+                    </a:stretch>
+                  </pic:blipFill>
+                  <pic:spPr>
+                    <a:xfrm>
+                      <a:off x="0" y="0"/>
+                      <a:ext cx="6120765" cy="1811020"/>
+                    </a:xfrm>
+                    <a:prstGeom prst="rect">
+                      <a:avLst/>
+                    </a:prstGeom>
+                  </pic:spPr>
+                </pic:pic>
+              </a:graphicData>
+            </a:graphic>
+          </wp:inline>
+        </w:drawing>
+      </w:r>
+    </w:p>
+    <w:p/>
+    <w:p/>
+    <w:p/>
+    <w:p/>
+    <w:p/>
+    <w:p/>
+    <w:p>
+      <w:r>
+        <w:lastRenderedPageBreak/>
+        <w:t>B3</w:t>
+      </w:r>
+      <w:r>
+        <w:t>7</w:t>
+      </w:r>
+      <w:r>
+        <w:t>: Truy cập vào file user.controller.js viết</w:t>
+      </w:r>
+    </w:p>
+    <w:p>
+      <w:r>
+        <w:drawing>
+          <wp:inline distT="0" distB="0" distL="0" distR="0" wp14:anchorId="782F2E74" wp14:editId="7A468A02">
+            <wp:extent cx="4953691" cy="8364117"/>
+            <wp:effectExtent l="0" t="0" r="0" b="0"/>
+            <wp:docPr id="783118112" name="Picture 1" descr="A screen shot of a computer program&#10;&#10;Description automatically generated"/>
+            <wp:cNvGraphicFramePr>
+              <a:graphicFrameLocks xmlns:a="http://schemas.openxmlformats.org/drawingml/2006/main" noChangeAspect="1"/>
+            </wp:cNvGraphicFramePr>
+            <a:graphic xmlns:a="http://schemas.openxmlformats.org/drawingml/2006/main">
+              <a:graphicData uri="http://schemas.openxmlformats.org/drawingml/2006/picture">
+                <pic:pic xmlns:pic="http://schemas.openxmlformats.org/drawingml/2006/picture">
+                  <pic:nvPicPr>
+                    <pic:cNvPr id="783118112" name="Picture 1" descr="A screen shot of a computer program&#10;&#10;Description automatically generated"/>
+                    <pic:cNvPicPr/>
+                  </pic:nvPicPr>
+                  <pic:blipFill>
+                    <a:blip r:embed="rId22"/>
+                    <a:stretch>
+                      <a:fillRect/>
+                    </a:stretch>
+                  </pic:blipFill>
+                  <pic:spPr>
+                    <a:xfrm>
+                      <a:off x="0" y="0"/>
+                      <a:ext cx="4953691" cy="8364117"/>
+                    </a:xfrm>
+                    <a:prstGeom prst="rect">
+                      <a:avLst/>
+                    </a:prstGeom>
+                  </pic:spPr>
+                </pic:pic>
+              </a:graphicData>
+            </a:graphic>
+          </wp:inline>
+        </w:drawing>
+      </w:r>
+    </w:p>
+    <w:p/>
+    <w:p>
+      <w:r>
+        <w:lastRenderedPageBreak/>
+        <w:t xml:space="preserve">B38: Tạo thư mục </w:t>
+      </w:r>
+      <w:r>
+        <w:rPr>
+          <w:highlight w:val="yellow"/>
+        </w:rPr>
+        <w:t>route</w:t>
+      </w:r>
+      <w:r>
+        <w:t xml:space="preserve"> trong thư mục </w:t>
+      </w:r>
+      <w:r>
+        <w:rPr>
+          <w:highlight w:val="yellow"/>
+        </w:rPr>
+        <w:t>server</w:t>
+      </w:r>
+    </w:p>
+    <w:p>
+      <w:r>
+        <w:t xml:space="preserve">B39: Tạo file user.route.js trong thư mục </w:t>
+      </w:r>
+      <w:r>
+        <w:rPr>
+          <w:highlight w:val="yellow"/>
+        </w:rPr>
+        <w:t>route</w:t>
+      </w:r>
+    </w:p>
+    <w:p>
+      <w:r>
+        <w:drawing>
+          <wp:inline distT="0" distB="0" distL="0" distR="0" wp14:anchorId="2393B862" wp14:editId="73DD7536">
+            <wp:extent cx="6120765" cy="1782445"/>
+            <wp:effectExtent l="0" t="0" r="0" b="8255"/>
+            <wp:docPr id="1350926876" name="Picture 1" descr="A screen shot of a computer screen&#10;&#10;Description automatically generated"/>
+            <wp:cNvGraphicFramePr>
+              <a:graphicFrameLocks xmlns:a="http://schemas.openxmlformats.org/drawingml/2006/main" noChangeAspect="1"/>
+            </wp:cNvGraphicFramePr>
+            <a:graphic xmlns:a="http://schemas.openxmlformats.org/drawingml/2006/main">
+              <a:graphicData uri="http://schemas.openxmlformats.org/drawingml/2006/picture">
+                <pic:pic xmlns:pic="http://schemas.openxmlformats.org/drawingml/2006/picture">
+                  <pic:nvPicPr>
+                    <pic:cNvPr id="1350926876" name="Picture 1" descr="A screen shot of a computer screen&#10;&#10;Description automatically generated"/>
+                    <pic:cNvPicPr/>
+                  </pic:nvPicPr>
+                  <pic:blipFill>
+                    <a:blip r:embed="rId23"/>
+                    <a:stretch>
+                      <a:fillRect/>
+                    </a:stretch>
+                  </pic:blipFill>
+                  <pic:spPr>
+                    <a:xfrm>
+                      <a:off x="0" y="0"/>
+                      <a:ext cx="6120765" cy="1782445"/>
+                    </a:xfrm>
+                    <a:prstGeom prst="rect">
+                      <a:avLst/>
+                    </a:prstGeom>
+                  </pic:spPr>
+                </pic:pic>
+              </a:graphicData>
+            </a:graphic>
+          </wp:inline>
+        </w:drawing>
+      </w:r>
+    </w:p>
+    <w:p>
+      <w:r>
+        <w:t>B40: Truy cập vào file index.js thêm lệnh</w:t>
+      </w:r>
+      <w:r>
+        <w:t xml:space="preserve"> app.use</w:t>
+      </w:r>
+      <w:r>
+        <w:drawing>
+          <wp:inline distT="0" distB="0" distL="0" distR="0" wp14:anchorId="1EFE5151" wp14:editId="27B12244">
+            <wp:extent cx="6120765" cy="556260"/>
+            <wp:effectExtent l="0" t="0" r="0" b="0"/>
+            <wp:docPr id="340565454" name="Picture 1"/>
+            <wp:cNvGraphicFramePr>
+              <a:graphicFrameLocks xmlns:a="http://schemas.openxmlformats.org/drawingml/2006/main" noChangeAspect="1"/>
+            </wp:cNvGraphicFramePr>
+            <a:graphic xmlns:a="http://schemas.openxmlformats.org/drawingml/2006/main">
+              <a:graphicData uri="http://schemas.openxmlformats.org/drawingml/2006/picture">
+                <pic:pic xmlns:pic="http://schemas.openxmlformats.org/drawingml/2006/picture">
+                  <pic:nvPicPr>
+                    <pic:cNvPr id="340565454" name=""/>
+                    <pic:cNvPicPr/>
+                  </pic:nvPicPr>
+                  <pic:blipFill>
+                    <a:blip r:embed="rId24"/>
+                    <a:stretch>
+                      <a:fillRect/>
+                    </a:stretch>
+                  </pic:blipFill>
+                  <pic:spPr>
+                    <a:xfrm>
+                      <a:off x="0" y="0"/>
+                      <a:ext cx="6120765" cy="556260"/>
+                    </a:xfrm>
+                    <a:prstGeom prst="rect">
+                      <a:avLst/>
+                    </a:prstGeom>
+                  </pic:spPr>
+                </pic:pic>
+              </a:graphicData>
+            </a:graphic>
+          </wp:inline>
+        </w:drawing>
+      </w:r>
+    </w:p>
+    <w:p>
+      <w:r>
+        <w:drawing>
+          <wp:inline distT="0" distB="0" distL="0" distR="0" wp14:anchorId="54AFD813" wp14:editId="3B505E07">
+            <wp:extent cx="5658640" cy="2057687"/>
+            <wp:effectExtent l="0" t="0" r="0" b="0"/>
+            <wp:docPr id="1097191302" name="Picture 1" descr="A screen shot of a computer program&#10;&#10;Description automatically generated"/>
+            <wp:cNvGraphicFramePr>
+              <a:graphicFrameLocks xmlns:a="http://schemas.openxmlformats.org/drawingml/2006/main" noChangeAspect="1"/>
+            </wp:cNvGraphicFramePr>
+            <a:graphic xmlns:a="http://schemas.openxmlformats.org/drawingml/2006/main">
+              <a:graphicData uri="http://schemas.openxmlformats.org/drawingml/2006/picture">
+                <pic:pic xmlns:pic="http://schemas.openxmlformats.org/drawingml/2006/picture">
+                  <pic:nvPicPr>
+                    <pic:cNvPr id="1097191302" name="Picture 1" descr="A screen shot of a computer program&#10;&#10;Description automatically generated"/>
+                    <pic:cNvPicPr/>
+                  </pic:nvPicPr>
+                  <pic:blipFill>
+                    <a:blip r:embed="rId25"/>
+                    <a:stretch>
+                      <a:fillRect/>
+                    </a:stretch>
+                  </pic:blipFill>
+                  <pic:spPr>
+                    <a:xfrm>
+                      <a:off x="0" y="0"/>
+                      <a:ext cx="5658640" cy="2057687"/>
+                    </a:xfrm>
+                    <a:prstGeom prst="rect">
+                      <a:avLst/>
+                    </a:prstGeom>
+                  </pic:spPr>
+                </pic:pic>
+              </a:graphicData>
+            </a:graphic>
+          </wp:inline>
+        </w:drawing>
+      </w:r>
+    </w:p>
+    <w:p>
+      <w:r>
+        <w:t>B41: Tải postmain và create collection binkeyit</w:t>
+      </w:r>
+    </w:p>
+    <w:p>
+      <w:r>
+        <w:t xml:space="preserve">B42: Tạo một đường dẫn mới </w:t>
+      </w:r>
+      <w:hyperlink r:id="rId26" w:history="1">
+        <w:r>
+          <w:rPr>
+            <w:rStyle w:val="Hyperlink"/>
+          </w:rPr>
+          <w:t>http://localhost:8080/api/user/register</w:t>
+        </w:r>
+      </w:hyperlink>
+      <w:r>
+        <w:t xml:space="preserve"> chuyển sang post và chuyển sang raw chọn JSON</w:t>
+      </w:r>
+      <w:r>
+        <w:t xml:space="preserve"> (lưu ý chạy npm run dev để chạy server lên local trước khi send)</w:t>
+      </w:r>
+    </w:p>
+    <w:p>
+      <w:r>
+        <w:drawing>
+          <wp:inline distT="0" distB="0" distL="0" distR="0" wp14:anchorId="0150F92B" wp14:editId="1D4DE8FB">
+            <wp:extent cx="6120765" cy="1555115"/>
+            <wp:effectExtent l="0" t="0" r="0" b="6985"/>
+            <wp:docPr id="2020061437" name="Picture 1" descr="A screenshot of a computer&#10;&#10;Description automatically generated"/>
+            <wp:cNvGraphicFramePr>
+              <a:graphicFrameLocks xmlns:a="http://schemas.openxmlformats.org/drawingml/2006/main" noChangeAspect="1"/>
+            </wp:cNvGraphicFramePr>
+            <a:graphic xmlns:a="http://schemas.openxmlformats.org/drawingml/2006/main">
+              <a:graphicData uri="http://schemas.openxmlformats.org/drawingml/2006/picture">
+                <pic:pic xmlns:pic="http://schemas.openxmlformats.org/drawingml/2006/picture">
+                  <pic:nvPicPr>
+                    <pic:cNvPr id="2020061437" name="Picture 1" descr="A screenshot of a computer&#10;&#10;Description automatically generated"/>
+                    <pic:cNvPicPr/>
+                  </pic:nvPicPr>
+                  <pic:blipFill>
+                    <a:blip r:embed="rId27"/>
+                    <a:stretch>
+                      <a:fillRect/>
+                    </a:stretch>
+                  </pic:blipFill>
+                  <pic:spPr>
+                    <a:xfrm>
+                      <a:off x="0" y="0"/>
+                      <a:ext cx="6120765" cy="1555115"/>
+                    </a:xfrm>
+                    <a:prstGeom prst="rect">
+                      <a:avLst/>
+                    </a:prstGeom>
+                  </pic:spPr>
+                </pic:pic>
+              </a:graphicData>
+            </a:graphic>
+          </wp:inline>
+        </w:drawing>
+      </w:r>
+    </w:p>
+    <w:p/>
+    <w:p/>
+    <w:p>
+      <w:r>
+        <w:lastRenderedPageBreak/>
+        <w:t>B43: Đăng kí cho user mới bằng postmain</w:t>
+      </w:r>
+      <w:r>
+        <w:t xml:space="preserve"> ghi các thông tin và bấm send ra như body là thành công</w:t>
+      </w:r>
+    </w:p>
+    <w:p>
+      <w:r>
+        <w:drawing>
+          <wp:inline distT="0" distB="0" distL="0" distR="0" wp14:anchorId="017D7B48" wp14:editId="2C54795E">
+            <wp:extent cx="6120765" cy="4754245"/>
+            <wp:effectExtent l="0" t="0" r="0" b="8255"/>
+            <wp:docPr id="699888042" name="Picture 1" descr="A screenshot of a computer&#10;&#10;Description automatically generated"/>
+            <wp:cNvGraphicFramePr>
+              <a:graphicFrameLocks xmlns:a="http://schemas.openxmlformats.org/drawingml/2006/main" noChangeAspect="1"/>
+            </wp:cNvGraphicFramePr>
+            <a:graphic xmlns:a="http://schemas.openxmlformats.org/drawingml/2006/main">
+              <a:graphicData uri="http://schemas.openxmlformats.org/drawingml/2006/picture">
+                <pic:pic xmlns:pic="http://schemas.openxmlformats.org/drawingml/2006/picture">
+                  <pic:nvPicPr>
+                    <pic:cNvPr id="699888042" name="Picture 1" descr="A screenshot of a computer&#10;&#10;Description automatically generated"/>
+                    <pic:cNvPicPr/>
+                  </pic:nvPicPr>
+                  <pic:blipFill>
+                    <a:blip r:embed="rId28"/>
+                    <a:stretch>
+                      <a:fillRect/>
+                    </a:stretch>
+                  </pic:blipFill>
+                  <pic:spPr>
+                    <a:xfrm>
+                      <a:off x="0" y="0"/>
+                      <a:ext cx="6120765" cy="4754245"/>
+                    </a:xfrm>
+                    <a:prstGeom prst="rect">
+                      <a:avLst/>
+                    </a:prstGeom>
+                  </pic:spPr>
+                </pic:pic>
+              </a:graphicData>
+            </a:graphic>
+          </wp:inline>
+        </w:drawing>
+      </w:r>
+    </w:p>
+    <w:p>
+      <w:pPr>
+        <w:tabs>
+          <w:tab w:val="left" w:pos="2415"/>
+        </w:tabs>
+      </w:pPr>
+      <w:r>
+        <w:t>B44: Thêm URL cho FRONTEND_URL</w:t>
+      </w:r>
+    </w:p>
+    <w:p>
+      <w:pPr>
+        <w:tabs>
+          <w:tab w:val="left" w:pos="2415"/>
+        </w:tabs>
+      </w:pPr>
+      <w:r>
+        <w:drawing>
+          <wp:inline distT="0" distB="0" distL="0" distR="0" wp14:anchorId="0BCA8A2D" wp14:editId="1446D330">
+            <wp:extent cx="5801535" cy="1076475"/>
+            <wp:effectExtent l="0" t="0" r="8890" b="9525"/>
+            <wp:docPr id="2140014669" name="Picture 1" descr="A screen shot of a computer&#10;&#10;Description automatically generated"/>
+            <wp:cNvGraphicFramePr>
+              <a:graphicFrameLocks xmlns:a="http://schemas.openxmlformats.org/drawingml/2006/main" noChangeAspect="1"/>
+            </wp:cNvGraphicFramePr>
+            <a:graphic xmlns:a="http://schemas.openxmlformats.org/drawingml/2006/main">
+              <a:graphicData uri="http://schemas.openxmlformats.org/drawingml/2006/picture">
+                <pic:pic xmlns:pic="http://schemas.openxmlformats.org/drawingml/2006/picture">
+                  <pic:nvPicPr>
+                    <pic:cNvPr id="2140014669" name="Picture 1" descr="A screen shot of a computer&#10;&#10;Description automatically generated"/>
+                    <pic:cNvPicPr/>
+                  </pic:nvPicPr>
+                  <pic:blipFill>
+                    <a:blip r:embed="rId29"/>
+                    <a:stretch>
+                      <a:fillRect/>
+                    </a:stretch>
+                  </pic:blipFill>
+                  <pic:spPr>
+                    <a:xfrm>
+                      <a:off x="0" y="0"/>
+                      <a:ext cx="5801535" cy="1076475"/>
+                    </a:xfrm>
+                    <a:prstGeom prst="rect">
+                      <a:avLst/>
+                    </a:prstGeom>
+                  </pic:spPr>
+                </pic:pic>
+              </a:graphicData>
+            </a:graphic>
+          </wp:inline>
+        </w:drawing>
+      </w:r>
+    </w:p>
+    <w:p>
+      <w:pPr>
+        <w:tabs>
+          <w:tab w:val="left" w:pos="2415"/>
+        </w:tabs>
+      </w:pPr>
+      <w:r>
+        <w:t>B45: Kiểm tra lại các thông tin đã load đầy đủ lên Mongodb.com chưa và kiểm tra cả bên resend.com</w:t>
+      </w:r>
     </w:p>
     <w:sectPr>
       <w:pgSz w:w="11907" w:h="16840" w:code="9"/>
@@ -1882,7 +2530,6 @@
   <w:style w:type="character" w:default="1" w:styleId="DefaultParagraphFont">
     <w:name w:val="Default Paragraph Font"/>
     <w:uiPriority w:val="1"/>
-    <w:semiHidden/>
     <w:unhideWhenUsed/>
   </w:style>
   <w:style w:type="table" w:default="1" w:styleId="TableNormal">
@@ -2194,6 +2841,29 @@
       <w:smallCaps/>
       <w:color w:val="0F4761" w:themeColor="accent1" w:themeShade="BF"/>
       <w:spacing w:val="5"/>
+    </w:rPr>
+  </w:style>
+  <w:style w:type="character" w:styleId="Hyperlink">
+    <w:name w:val="Hyperlink"/>
+    <w:basedOn w:val="DefaultParagraphFont"/>
+    <w:uiPriority w:val="99"/>
+    <w:unhideWhenUsed/>
+    <w:rsid w:val="00C21B6C"/>
+    <w:rPr>
+      <w:color w:val="467886" w:themeColor="hyperlink"/>
+      <w:u w:val="single"/>
+    </w:rPr>
+  </w:style>
+  <w:style w:type="character" w:styleId="UnresolvedMention">
+    <w:name w:val="Unresolved Mention"/>
+    <w:basedOn w:val="DefaultParagraphFont"/>
+    <w:uiPriority w:val="99"/>
+    <w:semiHidden/>
+    <w:unhideWhenUsed/>
+    <w:rsid w:val="00C21B6C"/>
+    <w:rPr>
+      <w:color w:val="605E5C"/>
+      <w:shd w:val="clear" w:color="auto" w:fill="E1DFDD"/>
     </w:rPr>
   </w:style>
 </w:styles>

</xml_diff>

<commit_message>
commit access token va refresh token va chay post login token
</commit_message>
<xml_diff>
--- a/DỰ ÁN.docx
+++ b/DỰ ÁN.docx
@@ -1,6 +1,6 @@
 
 <file path=word/document.xml><?xml version="1.0" encoding="utf-8"?>
-<w:document xmlns:wpc="http://schemas.microsoft.com/office/word/2010/wordprocessingCanvas" xmlns:cx="http://schemas.microsoft.com/office/drawing/2014/chartex" xmlns:cx1="http://schemas.microsoft.com/office/drawing/2015/9/8/chartex" xmlns:cx2="http://schemas.microsoft.com/office/drawing/2015/10/21/chartex" xmlns:cx3="http://schemas.microsoft.com/office/drawing/2016/5/9/chartex" xmlns:cx4="http://schemas.microsoft.com/office/drawing/2016/5/10/chartex" xmlns:cx5="http://schemas.microsoft.com/office/drawing/2016/5/11/chartex" xmlns:cx6="http://schemas.microsoft.com/office/drawing/2016/5/12/chartex" xmlns:cx7="http://schemas.microsoft.com/office/drawing/2016/5/13/chartex" xmlns:cx8="http://schemas.microsoft.com/office/drawing/2016/5/14/chartex" xmlns:mc="http://schemas.openxmlformats.org/markup-compatibility/2006" xmlns:aink="http://schemas.microsoft.com/office/drawing/2016/ink" xmlns:am3d="http://schemas.microsoft.com/office/drawing/2017/model3d" xmlns:o="urn:schemas-microsoft-com:office:office" xmlns:oel="http://schemas.microsoft.com/office/2019/extlst" xmlns:r="http://schemas.openxmlformats.org/officeDocument/2006/relationships" xmlns:m="http://schemas.openxmlformats.org/officeDocument/2006/math" xmlns:v="urn:schemas-microsoft-com:vml" xmlns:wp14="http://schemas.microsoft.com/office/word/2010/wordprocessingDrawing" xmlns:wp="http://schemas.openxmlformats.org/drawingml/2006/wordprocessingDrawing" xmlns:w10="urn:schemas-microsoft-com:office:word" xmlns:w="http://schemas.openxmlformats.org/wordprocessingml/2006/main" xmlns:w14="http://schemas.microsoft.com/office/word/2010/wordml" xmlns:w15="http://schemas.microsoft.com/office/word/2012/wordml" xmlns:w16cex="http://schemas.microsoft.com/office/word/2018/wordml/cex" xmlns:w16cid="http://schemas.microsoft.com/office/word/2016/wordml/cid" xmlns:w16="http://schemas.microsoft.com/office/word/2018/wordml" xmlns:w16du="http://schemas.microsoft.com/office/word/2023/wordml/word16du" xmlns:w16sdtdh="http://schemas.microsoft.com/office/word/2020/wordml/sdtdatahash" xmlns:w16se="http://schemas.microsoft.com/office/word/2015/wordml/symex" xmlns:wpg="http://schemas.microsoft.com/office/word/2010/wordprocessingGroup" xmlns:wpi="http://schemas.microsoft.com/office/word/2010/wordprocessingInk" xmlns:wne="http://schemas.microsoft.com/office/word/2006/wordml" xmlns:wps="http://schemas.microsoft.com/office/word/2010/wordprocessingShape" mc:Ignorable="w14 w15 w16se w16cid w16 w16cex w16sdtdh w16du wp14">
+<w:document xmlns:wpc="http://schemas.microsoft.com/office/word/2010/wordprocessingCanvas" xmlns:cx="http://schemas.microsoft.com/office/drawing/2014/chartex" xmlns:cx1="http://schemas.microsoft.com/office/drawing/2015/9/8/chartex" xmlns:cx2="http://schemas.microsoft.com/office/drawing/2015/10/21/chartex" xmlns:cx3="http://schemas.microsoft.com/office/drawing/2016/5/9/chartex" xmlns:cx4="http://schemas.microsoft.com/office/drawing/2016/5/10/chartex" xmlns:cx5="http://schemas.microsoft.com/office/drawing/2016/5/11/chartex" xmlns:cx6="http://schemas.microsoft.com/office/drawing/2016/5/12/chartex" xmlns:cx7="http://schemas.microsoft.com/office/drawing/2016/5/13/chartex" xmlns:cx8="http://schemas.microsoft.com/office/drawing/2016/5/14/chartex" xmlns:mc="http://schemas.openxmlformats.org/markup-compatibility/2006" xmlns:aink="http://schemas.microsoft.com/office/drawing/2016/ink" xmlns:am3d="http://schemas.microsoft.com/office/drawing/2017/model3d" xmlns:o="urn:schemas-microsoft-com:office:office" xmlns:oel="http://schemas.microsoft.com/office/2019/extlst" xmlns:r="http://schemas.openxmlformats.org/officeDocument/2006/relationships" xmlns:m="http://schemas.openxmlformats.org/officeDocument/2006/math" xmlns:v="urn:schemas-microsoft-com:vml" xmlns:wp14="http://schemas.microsoft.com/office/word/2010/wordprocessingDrawing" xmlns:wp="http://schemas.openxmlformats.org/drawingml/2006/wordprocessingDrawing" xmlns:w10="urn:schemas-microsoft-com:office:word" xmlns:w="http://schemas.openxmlformats.org/wordprocessingml/2006/main" xmlns:w14="http://schemas.microsoft.com/office/word/2010/wordml" xmlns:w15="http://schemas.microsoft.com/office/word/2012/wordml" xmlns:w16cex="http://schemas.microsoft.com/office/word/2018/wordml/cex" xmlns:w16cid="http://schemas.microsoft.com/office/word/2016/wordml/cid" xmlns:w16="http://schemas.microsoft.com/office/word/2018/wordml" xmlns:w16du="http://schemas.microsoft.com/office/word/2023/wordml/word16du" xmlns:w16sdtdh="http://schemas.microsoft.com/office/word/2020/wordml/sdtdatahash" xmlns:w16sdtfl="http://schemas.microsoft.com/office/word/2024/wordml/sdtformatlock" xmlns:w16se="http://schemas.microsoft.com/office/word/2015/wordml/symex" xmlns:wpg="http://schemas.microsoft.com/office/word/2010/wordprocessingGroup" xmlns:wpi="http://schemas.microsoft.com/office/word/2010/wordprocessingInk" xmlns:wne="http://schemas.microsoft.com/office/word/2006/wordml" xmlns:wps="http://schemas.microsoft.com/office/word/2010/wordprocessingShape" mc:Ignorable="w14 w15 w16se w16cid w16 w16cex w16sdtdh w16sdtfl w16du wp14">
   <w:body>
     <w:p>
       <w:pPr>
@@ -1265,6 +1265,9 @@
         </w:tabs>
       </w:pPr>
       <w:r>
+        <w:rPr>
+          <w:noProof/>
+        </w:rPr>
         <w:drawing>
           <wp:inline distT="0" distB="0" distL="0" distR="0" wp14:anchorId="49B6BE4A" wp14:editId="7DF63537">
             <wp:extent cx="6120765" cy="1011555"/>
@@ -1405,6 +1408,9 @@
         </w:tabs>
       </w:pPr>
       <w:r>
+        <w:rPr>
+          <w:noProof/>
+        </w:rPr>
         <w:drawing>
           <wp:inline distT="0" distB="0" distL="0" distR="0" wp14:anchorId="7A8C4CDA" wp14:editId="5A240048">
             <wp:extent cx="3905250" cy="3952247"/>
@@ -1491,10 +1497,10 @@
     <w:p>
       <w:r>
         <w:drawing>
-          <wp:inline distT="0" distB="0" distL="0" distR="0" wp14:anchorId="31239D14" wp14:editId="7A29EDF6">
-            <wp:extent cx="6120765" cy="1811020"/>
-            <wp:effectExtent l="0" t="0" r="0" b="0"/>
-            <wp:docPr id="2037707186" name="Picture 1" descr="A screen shot of a computer code&#10;&#10;Description automatically generated"/>
+          <wp:inline distT="0" distB="0" distL="0" distR="0" wp14:anchorId="1B5E4C72" wp14:editId="7CC7491D">
+            <wp:extent cx="6120765" cy="1823085"/>
+            <wp:effectExtent l="0" t="0" r="0" b="5715"/>
+            <wp:docPr id="627617371" name="Picture 1" descr="A screen shot of a computer&#10;&#10;Description automatically generated"/>
             <wp:cNvGraphicFramePr>
               <a:graphicFrameLocks xmlns:a="http://schemas.openxmlformats.org/drawingml/2006/main" noChangeAspect="1"/>
             </wp:cNvGraphicFramePr>
@@ -1502,7 +1508,7 @@
               <a:graphicData uri="http://schemas.openxmlformats.org/drawingml/2006/picture">
                 <pic:pic xmlns:pic="http://schemas.openxmlformats.org/drawingml/2006/picture">
                   <pic:nvPicPr>
-                    <pic:cNvPr id="2037707186" name="Picture 1" descr="A screen shot of a computer code&#10;&#10;Description automatically generated"/>
+                    <pic:cNvPr id="627617371" name="Picture 1" descr="A screen shot of a computer&#10;&#10;Description automatically generated"/>
                     <pic:cNvPicPr/>
                   </pic:nvPicPr>
                   <pic:blipFill>
@@ -1514,7 +1520,7 @@
                   <pic:spPr>
                     <a:xfrm>
                       <a:off x="0" y="0"/>
-                      <a:ext cx="6120765" cy="1811020"/>
+                      <a:ext cx="6120765" cy="1823085"/>
                     </a:xfrm>
                     <a:prstGeom prst="rect">
                       <a:avLst/>
@@ -1547,6 +1553,9 @@
     </w:p>
     <w:p>
       <w:r>
+        <w:rPr>
+          <w:noProof/>
+        </w:rPr>
         <w:drawing>
           <wp:inline distT="0" distB="0" distL="0" distR="0" wp14:anchorId="782F2E74" wp14:editId="7A468A02">
             <wp:extent cx="4953691" cy="8364117"/>
@@ -1619,6 +1628,9 @@
     </w:p>
     <w:p>
       <w:r>
+        <w:rPr>
+          <w:noProof/>
+        </w:rPr>
         <w:drawing>
           <wp:inline distT="0" distB="0" distL="0" distR="0" wp14:anchorId="2393B862" wp14:editId="73DD7536">
             <wp:extent cx="6120765" cy="1782445"/>
@@ -1664,6 +1676,9 @@
         <w:t xml:space="preserve"> app.use</w:t>
       </w:r>
       <w:r>
+        <w:rPr>
+          <w:noProof/>
+        </w:rPr>
         <w:drawing>
           <wp:inline distT="0" distB="0" distL="0" distR="0" wp14:anchorId="1EFE5151" wp14:editId="27B12244">
             <wp:extent cx="6120765" cy="556260"/>
@@ -1703,6 +1718,9 @@
     </w:p>
     <w:p>
       <w:r>
+        <w:rPr>
+          <w:noProof/>
+        </w:rPr>
         <w:drawing>
           <wp:inline distT="0" distB="0" distL="0" distR="0" wp14:anchorId="54AFD813" wp14:editId="3B505E07">
             <wp:extent cx="5658640" cy="2057687"/>
@@ -1766,6 +1784,9 @@
     </w:p>
     <w:p>
       <w:r>
+        <w:rPr>
+          <w:noProof/>
+        </w:rPr>
         <w:drawing>
           <wp:inline distT="0" distB="0" distL="0" distR="0" wp14:anchorId="0150F92B" wp14:editId="1D4DE8FB">
             <wp:extent cx="6120765" cy="1555115"/>
@@ -1816,6 +1837,9 @@
     </w:p>
     <w:p>
       <w:r>
+        <w:rPr>
+          <w:noProof/>
+        </w:rPr>
         <w:drawing>
           <wp:inline distT="0" distB="0" distL="0" distR="0" wp14:anchorId="017D7B48" wp14:editId="2C54795E">
             <wp:extent cx="6120765" cy="4754245"/>
@@ -1870,6 +1894,9 @@
         </w:tabs>
       </w:pPr>
       <w:r>
+        <w:rPr>
+          <w:noProof/>
+        </w:rPr>
         <w:drawing>
           <wp:inline distT="0" distB="0" distL="0" distR="0" wp14:anchorId="0BCA8A2D" wp14:editId="1446D330">
             <wp:extent cx="5801535" cy="1076475"/>
@@ -1917,6 +1944,454 @@
         <w:t>B45: Kiểm tra lại các thông tin đã load đầy đủ lên Mongodb.com chưa và kiểm tra cả bên resend.com</w:t>
       </w:r>
     </w:p>
+    <w:p>
+      <w:pPr>
+        <w:tabs>
+          <w:tab w:val="left" w:pos="2415"/>
+        </w:tabs>
+      </w:pPr>
+    </w:p>
+    <w:p>
+      <w:pPr>
+        <w:tabs>
+          <w:tab w:val="left" w:pos="2415"/>
+        </w:tabs>
+      </w:pPr>
+    </w:p>
+    <w:p>
+      <w:pPr>
+        <w:tabs>
+          <w:tab w:val="left" w:pos="2415"/>
+        </w:tabs>
+      </w:pPr>
+    </w:p>
+    <w:p>
+      <w:pPr>
+        <w:tabs>
+          <w:tab w:val="left" w:pos="2415"/>
+        </w:tabs>
+      </w:pPr>
+    </w:p>
+    <w:p>
+      <w:pPr>
+        <w:tabs>
+          <w:tab w:val="left" w:pos="2415"/>
+        </w:tabs>
+      </w:pPr>
+    </w:p>
+    <w:p>
+      <w:pPr>
+        <w:tabs>
+          <w:tab w:val="left" w:pos="2415"/>
+        </w:tabs>
+      </w:pPr>
+      <w:r>
+        <w:lastRenderedPageBreak/>
+        <w:t>B46: Tạo accessToken và refreshToken</w:t>
+      </w:r>
+    </w:p>
+    <w:p>
+      <w:pPr>
+        <w:tabs>
+          <w:tab w:val="left" w:pos="2415"/>
+        </w:tabs>
+      </w:pPr>
+      <w:r>
+        <w:t xml:space="preserve">B47: Ở thư mục ultils tạo file </w:t>
+      </w:r>
+      <w:r>
+        <w:t>generatedAccessToken</w:t>
+      </w:r>
+      <w:r>
+        <w:t>.js trong file gồm có</w:t>
+      </w:r>
+    </w:p>
+    <w:p>
+      <w:pPr>
+        <w:tabs>
+          <w:tab w:val="left" w:pos="2415"/>
+        </w:tabs>
+      </w:pPr>
+      <w:r>
+        <w:drawing>
+          <wp:inline distT="0" distB="0" distL="0" distR="0" wp14:anchorId="2CF06EB4" wp14:editId="6378206F">
+            <wp:extent cx="2870200" cy="1592470"/>
+            <wp:effectExtent l="0" t="0" r="6350" b="8255"/>
+            <wp:docPr id="40264520" name="Picture 1" descr="A screen shot of a computer code&#10;&#10;Description automatically generated"/>
+            <wp:cNvGraphicFramePr>
+              <a:graphicFrameLocks xmlns:a="http://schemas.openxmlformats.org/drawingml/2006/main" noChangeAspect="1"/>
+            </wp:cNvGraphicFramePr>
+            <a:graphic xmlns:a="http://schemas.openxmlformats.org/drawingml/2006/main">
+              <a:graphicData uri="http://schemas.openxmlformats.org/drawingml/2006/picture">
+                <pic:pic xmlns:pic="http://schemas.openxmlformats.org/drawingml/2006/picture">
+                  <pic:nvPicPr>
+                    <pic:cNvPr id="40264520" name="Picture 1" descr="A screen shot of a computer code&#10;&#10;Description automatically generated"/>
+                    <pic:cNvPicPr/>
+                  </pic:nvPicPr>
+                  <pic:blipFill>
+                    <a:blip r:embed="rId30"/>
+                    <a:stretch>
+                      <a:fillRect/>
+                    </a:stretch>
+                  </pic:blipFill>
+                  <pic:spPr>
+                    <a:xfrm>
+                      <a:off x="0" y="0"/>
+                      <a:ext cx="2884557" cy="1600436"/>
+                    </a:xfrm>
+                    <a:prstGeom prst="rect">
+                      <a:avLst/>
+                    </a:prstGeom>
+                  </pic:spPr>
+                </pic:pic>
+              </a:graphicData>
+            </a:graphic>
+          </wp:inline>
+        </w:drawing>
+      </w:r>
+    </w:p>
+    <w:p>
+      <w:pPr>
+        <w:tabs>
+          <w:tab w:val="left" w:pos="2415"/>
+        </w:tabs>
+      </w:pPr>
+      <w:r>
+        <w:t xml:space="preserve">B48: </w:t>
+      </w:r>
+      <w:r>
+        <w:t xml:space="preserve">Ở thư mục ultils tạo file </w:t>
+      </w:r>
+      <w:r>
+        <w:t>generatedRefreshToken</w:t>
+      </w:r>
+      <w:r>
+        <w:t>.js trong file gồm có</w:t>
+      </w:r>
+    </w:p>
+    <w:p>
+      <w:pPr>
+        <w:tabs>
+          <w:tab w:val="left" w:pos="2415"/>
+        </w:tabs>
+      </w:pPr>
+      <w:r>
+        <w:drawing>
+          <wp:inline distT="0" distB="0" distL="0" distR="0" wp14:anchorId="43A09A07" wp14:editId="53F22FA0">
+            <wp:extent cx="3098800" cy="2337843"/>
+            <wp:effectExtent l="0" t="0" r="6350" b="5715"/>
+            <wp:docPr id="83630723" name="Picture 1" descr="A screen shot of a computer program&#10;&#10;Description automatically generated"/>
+            <wp:cNvGraphicFramePr>
+              <a:graphicFrameLocks xmlns:a="http://schemas.openxmlformats.org/drawingml/2006/main" noChangeAspect="1"/>
+            </wp:cNvGraphicFramePr>
+            <a:graphic xmlns:a="http://schemas.openxmlformats.org/drawingml/2006/main">
+              <a:graphicData uri="http://schemas.openxmlformats.org/drawingml/2006/picture">
+                <pic:pic xmlns:pic="http://schemas.openxmlformats.org/drawingml/2006/picture">
+                  <pic:nvPicPr>
+                    <pic:cNvPr id="83630723" name="Picture 1" descr="A screen shot of a computer program&#10;&#10;Description automatically generated"/>
+                    <pic:cNvPicPr/>
+                  </pic:nvPicPr>
+                  <pic:blipFill>
+                    <a:blip r:embed="rId31"/>
+                    <a:stretch>
+                      <a:fillRect/>
+                    </a:stretch>
+                  </pic:blipFill>
+                  <pic:spPr>
+                    <a:xfrm>
+                      <a:off x="0" y="0"/>
+                      <a:ext cx="3112472" cy="2348158"/>
+                    </a:xfrm>
+                    <a:prstGeom prst="rect">
+                      <a:avLst/>
+                    </a:prstGeom>
+                  </pic:spPr>
+                </pic:pic>
+              </a:graphicData>
+            </a:graphic>
+          </wp:inline>
+        </w:drawing>
+      </w:r>
+    </w:p>
+    <w:p>
+      <w:pPr>
+        <w:tabs>
+          <w:tab w:val="left" w:pos="2415"/>
+        </w:tabs>
+      </w:pPr>
+      <w:r>
+        <w:t>B49</w:t>
+      </w:r>
+      <w:r>
+        <w:t xml:space="preserve">: Ở file user.controller.js bổ sung thêm 2 function </w:t>
+      </w:r>
+      <w:r>
+        <w:t>verifyEmailController</w:t>
+      </w:r>
+      <w:r>
+        <w:t xml:space="preserve"> và loginController</w:t>
+      </w:r>
+    </w:p>
+    <w:p>
+      <w:pPr>
+        <w:tabs>
+          <w:tab w:val="left" w:pos="2415"/>
+        </w:tabs>
+      </w:pPr>
+      <w:r>
+        <w:drawing>
+          <wp:inline distT="0" distB="0" distL="0" distR="0" wp14:anchorId="551F3EFE" wp14:editId="7C77D30A">
+            <wp:extent cx="3062463" cy="3270250"/>
+            <wp:effectExtent l="0" t="0" r="5080" b="6350"/>
+            <wp:docPr id="1404422134" name="Picture 1" descr="A screen shot of a computer program&#10;&#10;Description automatically generated"/>
+            <wp:cNvGraphicFramePr>
+              <a:graphicFrameLocks xmlns:a="http://schemas.openxmlformats.org/drawingml/2006/main" noChangeAspect="1"/>
+            </wp:cNvGraphicFramePr>
+            <a:graphic xmlns:a="http://schemas.openxmlformats.org/drawingml/2006/main">
+              <a:graphicData uri="http://schemas.openxmlformats.org/drawingml/2006/picture">
+                <pic:pic xmlns:pic="http://schemas.openxmlformats.org/drawingml/2006/picture">
+                  <pic:nvPicPr>
+                    <pic:cNvPr id="1404422134" name="Picture 1" descr="A screen shot of a computer program&#10;&#10;Description automatically generated"/>
+                    <pic:cNvPicPr/>
+                  </pic:nvPicPr>
+                  <pic:blipFill>
+                    <a:blip r:embed="rId32"/>
+                    <a:stretch>
+                      <a:fillRect/>
+                    </a:stretch>
+                  </pic:blipFill>
+                  <pic:spPr>
+                    <a:xfrm>
+                      <a:off x="0" y="0"/>
+                      <a:ext cx="3069672" cy="3277948"/>
+                    </a:xfrm>
+                    <a:prstGeom prst="rect">
+                      <a:avLst/>
+                    </a:prstGeom>
+                  </pic:spPr>
+                </pic:pic>
+              </a:graphicData>
+            </a:graphic>
+          </wp:inline>
+        </w:drawing>
+      </w:r>
+    </w:p>
+    <w:p>
+      <w:pPr>
+        <w:tabs>
+          <w:tab w:val="left" w:pos="2415"/>
+        </w:tabs>
+      </w:pPr>
+      <w:r>
+        <w:lastRenderedPageBreak/>
+        <w:drawing>
+          <wp:inline distT="0" distB="0" distL="0" distR="0" wp14:anchorId="727B2BF1" wp14:editId="0950B7A8">
+            <wp:extent cx="3845765" cy="4965700"/>
+            <wp:effectExtent l="0" t="0" r="2540" b="6350"/>
+            <wp:docPr id="2053067287" name="Picture 1" descr="A screen shot of a computer program&#10;&#10;Description automatically generated"/>
+            <wp:cNvGraphicFramePr>
+              <a:graphicFrameLocks xmlns:a="http://schemas.openxmlformats.org/drawingml/2006/main" noChangeAspect="1"/>
+            </wp:cNvGraphicFramePr>
+            <a:graphic xmlns:a="http://schemas.openxmlformats.org/drawingml/2006/main">
+              <a:graphicData uri="http://schemas.openxmlformats.org/drawingml/2006/picture">
+                <pic:pic xmlns:pic="http://schemas.openxmlformats.org/drawingml/2006/picture">
+                  <pic:nvPicPr>
+                    <pic:cNvPr id="2053067287" name="Picture 1" descr="A screen shot of a computer program&#10;&#10;Description automatically generated"/>
+                    <pic:cNvPicPr/>
+                  </pic:nvPicPr>
+                  <pic:blipFill>
+                    <a:blip r:embed="rId33"/>
+                    <a:stretch>
+                      <a:fillRect/>
+                    </a:stretch>
+                  </pic:blipFill>
+                  <pic:spPr>
+                    <a:xfrm>
+                      <a:off x="0" y="0"/>
+                      <a:ext cx="3865257" cy="4990868"/>
+                    </a:xfrm>
+                    <a:prstGeom prst="rect">
+                      <a:avLst/>
+                    </a:prstGeom>
+                  </pic:spPr>
+                </pic:pic>
+              </a:graphicData>
+            </a:graphic>
+          </wp:inline>
+        </w:drawing>
+      </w:r>
+    </w:p>
+    <w:p>
+      <w:pPr>
+        <w:tabs>
+          <w:tab w:val="left" w:pos="2415"/>
+        </w:tabs>
+      </w:pPr>
+      <w:r>
+        <w:drawing>
+          <wp:inline distT="0" distB="0" distL="0" distR="0" wp14:anchorId="5DE61E3E" wp14:editId="41A9CE53">
+            <wp:extent cx="4070785" cy="3733800"/>
+            <wp:effectExtent l="0" t="0" r="6350" b="0"/>
+            <wp:docPr id="1162679191" name="Picture 1" descr="A screen shot of a computer program&#10;&#10;Description automatically generated"/>
+            <wp:cNvGraphicFramePr>
+              <a:graphicFrameLocks xmlns:a="http://schemas.openxmlformats.org/drawingml/2006/main" noChangeAspect="1"/>
+            </wp:cNvGraphicFramePr>
+            <a:graphic xmlns:a="http://schemas.openxmlformats.org/drawingml/2006/main">
+              <a:graphicData uri="http://schemas.openxmlformats.org/drawingml/2006/picture">
+                <pic:pic xmlns:pic="http://schemas.openxmlformats.org/drawingml/2006/picture">
+                  <pic:nvPicPr>
+                    <pic:cNvPr id="1162679191" name="Picture 1" descr="A screen shot of a computer program&#10;&#10;Description automatically generated"/>
+                    <pic:cNvPicPr/>
+                  </pic:nvPicPr>
+                  <pic:blipFill>
+                    <a:blip r:embed="rId34"/>
+                    <a:stretch>
+                      <a:fillRect/>
+                    </a:stretch>
+                  </pic:blipFill>
+                  <pic:spPr>
+                    <a:xfrm>
+                      <a:off x="0" y="0"/>
+                      <a:ext cx="4075087" cy="3737746"/>
+                    </a:xfrm>
+                    <a:prstGeom prst="rect">
+                      <a:avLst/>
+                    </a:prstGeom>
+                  </pic:spPr>
+                </pic:pic>
+              </a:graphicData>
+            </a:graphic>
+          </wp:inline>
+        </w:drawing>
+      </w:r>
+    </w:p>
+    <w:p>
+      <w:pPr>
+        <w:tabs>
+          <w:tab w:val="left" w:pos="2415"/>
+        </w:tabs>
+      </w:pPr>
+    </w:p>
+    <w:p>
+      <w:pPr>
+        <w:tabs>
+          <w:tab w:val="left" w:pos="2415"/>
+        </w:tabs>
+      </w:pPr>
+      <w:r>
+        <w:lastRenderedPageBreak/>
+        <w:t>B50: Ở file user.router.js bổ sung thêm đường dẫn để post</w:t>
+      </w:r>
+    </w:p>
+    <w:p>
+      <w:pPr>
+        <w:tabs>
+          <w:tab w:val="left" w:pos="2415"/>
+        </w:tabs>
+      </w:pPr>
+      <w:r>
+        <w:drawing>
+          <wp:inline distT="0" distB="0" distL="0" distR="0" wp14:anchorId="40F78884" wp14:editId="0E055635">
+            <wp:extent cx="6120765" cy="2063750"/>
+            <wp:effectExtent l="0" t="0" r="0" b="0"/>
+            <wp:docPr id="997897688" name="Picture 1" descr="A screen shot of a computer&#10;&#10;Description automatically generated"/>
+            <wp:cNvGraphicFramePr>
+              <a:graphicFrameLocks xmlns:a="http://schemas.openxmlformats.org/drawingml/2006/main" noChangeAspect="1"/>
+            </wp:cNvGraphicFramePr>
+            <a:graphic xmlns:a="http://schemas.openxmlformats.org/drawingml/2006/main">
+              <a:graphicData uri="http://schemas.openxmlformats.org/drawingml/2006/picture">
+                <pic:pic xmlns:pic="http://schemas.openxmlformats.org/drawingml/2006/picture">
+                  <pic:nvPicPr>
+                    <pic:cNvPr id="997897688" name="Picture 1" descr="A screen shot of a computer&#10;&#10;Description automatically generated"/>
+                    <pic:cNvPicPr/>
+                  </pic:nvPicPr>
+                  <pic:blipFill>
+                    <a:blip r:embed="rId35"/>
+                    <a:stretch>
+                      <a:fillRect/>
+                    </a:stretch>
+                  </pic:blipFill>
+                  <pic:spPr>
+                    <a:xfrm>
+                      <a:off x="0" y="0"/>
+                      <a:ext cx="6120765" cy="2063750"/>
+                    </a:xfrm>
+                    <a:prstGeom prst="rect">
+                      <a:avLst/>
+                    </a:prstGeom>
+                  </pic:spPr>
+                </pic:pic>
+              </a:graphicData>
+            </a:graphic>
+          </wp:inline>
+        </w:drawing>
+      </w:r>
+    </w:p>
+    <w:p>
+      <w:pPr>
+        <w:tabs>
+          <w:tab w:val="left" w:pos="2415"/>
+        </w:tabs>
+      </w:pPr>
+      <w:r>
+        <w:t xml:space="preserve">B51: Chạy </w:t>
+      </w:r>
+      <w:hyperlink r:id="rId36" w:history="1">
+        <w:r>
+          <w:rPr>
+            <w:rStyle w:val="Hyperlink"/>
+          </w:rPr>
+          <w:t>http://localhost:8080/api/user/login</w:t>
+        </w:r>
+      </w:hyperlink>
+      <w:r>
+        <w:t xml:space="preserve"> với các dữ liệu sau xem thành công </w:t>
+      </w:r>
+    </w:p>
+    <w:p>
+      <w:pPr>
+        <w:tabs>
+          <w:tab w:val="left" w:pos="2415"/>
+        </w:tabs>
+      </w:pPr>
+      <w:r>
+        <w:drawing>
+          <wp:inline distT="0" distB="0" distL="0" distR="0" wp14:anchorId="36E63BAB" wp14:editId="1FD5C312">
+            <wp:extent cx="6120765" cy="3785870"/>
+            <wp:effectExtent l="0" t="0" r="0" b="5080"/>
+            <wp:docPr id="8386056" name="Picture 1" descr="A screenshot of a computer&#10;&#10;Description automatically generated"/>
+            <wp:cNvGraphicFramePr>
+              <a:graphicFrameLocks xmlns:a="http://schemas.openxmlformats.org/drawingml/2006/main" noChangeAspect="1"/>
+            </wp:cNvGraphicFramePr>
+            <a:graphic xmlns:a="http://schemas.openxmlformats.org/drawingml/2006/main">
+              <a:graphicData uri="http://schemas.openxmlformats.org/drawingml/2006/picture">
+                <pic:pic xmlns:pic="http://schemas.openxmlformats.org/drawingml/2006/picture">
+                  <pic:nvPicPr>
+                    <pic:cNvPr id="8386056" name="Picture 1" descr="A screenshot of a computer&#10;&#10;Description automatically generated"/>
+                    <pic:cNvPicPr/>
+                  </pic:nvPicPr>
+                  <pic:blipFill>
+                    <a:blip r:embed="rId37"/>
+                    <a:stretch>
+                      <a:fillRect/>
+                    </a:stretch>
+                  </pic:blipFill>
+                  <pic:spPr>
+                    <a:xfrm>
+                      <a:off x="0" y="0"/>
+                      <a:ext cx="6120765" cy="3785870"/>
+                    </a:xfrm>
+                    <a:prstGeom prst="rect">
+                      <a:avLst/>
+                    </a:prstGeom>
+                  </pic:spPr>
+                </pic:pic>
+              </a:graphicData>
+            </a:graphic>
+          </wp:inline>
+        </w:drawing>
+      </w:r>
+    </w:p>
     <w:sectPr>
       <w:pgSz w:w="11907" w:h="16840" w:code="9"/>
       <w:pgMar w:top="1134" w:right="1134" w:bottom="1134" w:left="1134" w:header="720" w:footer="720" w:gutter="0"/>
@@ -1928,7 +2403,7 @@
 </file>
 
 <file path=word/styles.xml><?xml version="1.0" encoding="utf-8"?>
-<w:styles xmlns:mc="http://schemas.openxmlformats.org/markup-compatibility/2006" xmlns:r="http://schemas.openxmlformats.org/officeDocument/2006/relationships" xmlns:w="http://schemas.openxmlformats.org/wordprocessingml/2006/main" xmlns:w14="http://schemas.microsoft.com/office/word/2010/wordml" xmlns:w15="http://schemas.microsoft.com/office/word/2012/wordml" xmlns:w16cex="http://schemas.microsoft.com/office/word/2018/wordml/cex" xmlns:w16cid="http://schemas.microsoft.com/office/word/2016/wordml/cid" xmlns:w16="http://schemas.microsoft.com/office/word/2018/wordml" xmlns:w16du="http://schemas.microsoft.com/office/word/2023/wordml/word16du" xmlns:w16sdtdh="http://schemas.microsoft.com/office/word/2020/wordml/sdtdatahash" xmlns:w16se="http://schemas.microsoft.com/office/word/2015/wordml/symex" mc:Ignorable="w14 w15 w16se w16cid w16 w16cex w16sdtdh w16du">
+<w:styles xmlns:mc="http://schemas.openxmlformats.org/markup-compatibility/2006" xmlns:r="http://schemas.openxmlformats.org/officeDocument/2006/relationships" xmlns:w="http://schemas.openxmlformats.org/wordprocessingml/2006/main" xmlns:w14="http://schemas.microsoft.com/office/word/2010/wordml" xmlns:w15="http://schemas.microsoft.com/office/word/2012/wordml" xmlns:w16cex="http://schemas.microsoft.com/office/word/2018/wordml/cex" xmlns:w16cid="http://schemas.microsoft.com/office/word/2016/wordml/cid" xmlns:w16="http://schemas.microsoft.com/office/word/2018/wordml" xmlns:w16du="http://schemas.microsoft.com/office/word/2023/wordml/word16du" xmlns:w16sdtdh="http://schemas.microsoft.com/office/word/2020/wordml/sdtdatahash" xmlns:w16sdtfl="http://schemas.microsoft.com/office/word/2024/wordml/sdtformatlock" xmlns:w16se="http://schemas.microsoft.com/office/word/2015/wordml/symex" mc:Ignorable="w14 w15 w16se w16cid w16 w16cex w16sdtdh w16sdtfl w16du">
   <w:docDefaults>
     <w:rPrDefault>
       <w:rPr>
@@ -2866,6 +3341,18 @@
       <w:shd w:val="clear" w:color="auto" w:fill="E1DFDD"/>
     </w:rPr>
   </w:style>
+  <w:style w:type="character" w:styleId="FollowedHyperlink">
+    <w:name w:val="FollowedHyperlink"/>
+    <w:basedOn w:val="DefaultParagraphFont"/>
+    <w:uiPriority w:val="99"/>
+    <w:semiHidden/>
+    <w:unhideWhenUsed/>
+    <w:rsid w:val="007D51DD"/>
+    <w:rPr>
+      <w:color w:val="96607D" w:themeColor="followedHyperlink"/>
+      <w:u w:val="single"/>
+    </w:rPr>
+  </w:style>
 </w:styles>
 </file>
 

</xml_diff>